<commit_message>
docs(07): completa encabezado y pie de pagina con el nombre del proyecto SkyCampus
</commit_message>
<xml_diff>
--- a/07 · Plantilla DOSW/SC-01_Registrar_mision_DOSW.docx
+++ b/07 · Plantilla DOSW/SC-01_Registrar_mision_DOSW.docx
@@ -79,7 +79,7 @@
                 <w:sz w:val="24"/>
                 <w:szCs w:val="24"/>
               </w:rPr>
-              <w:t>NOMBRE PROYECTO</w:t>
+              <w:t>SKYCAMPUS</w:t>
             </w:r>
           </w:p>
           <w:p>
@@ -4615,7 +4615,7 @@
         <w:sz w:val="16"/>
         <w:szCs w:val="16"/>
       </w:rPr>
-      <w:t xml:space="preserve">Proyecto: Nombre del Proyecto    |    DOSW 2026    |    Página </w:t>
+      <w:t xml:space="preserve">Proyecto: SkyCampus    |    DOSW 2026    |    Página </w:t>
     </w:r>
     <w:r>
       <w:rPr>

</xml_diff>